<commit_message>
Submission folder: archive old parallel-design files, doc fixes (video separate, dvs path, progress §236), shorter script
Co-Authored-By: Claude Sonnet 5.5 <noreply@anthropic.com>
Claude-Session: https://claude.ai/code/session_017w9Wz8TNpiESdat1g61ZHB
</commit_message>
<xml_diff>
--- a/submission/REDRED_제출설명_1쪽_칩S.docx
+++ b/submission/REDRED_제출설명_1쪽_칩S.docx
@@ -512,7 +512,7 @@
                 <w:b w:val="0"/>
                 <w:sz w:val="18"/>
               </w:rPr>
-              <w:t>제출 파일: 발표자료 .pptx/.pdf, 본 설명서, 발표 영상, 그림·덱 생성 스크립트(figgen/)</w:t>
+              <w:t>제출 파일: 칩 S 발표자료 REDRED_2차_발표자료_칩S(.pptx/.pdf), 본 설명서, 발표 대본, 그림·덱 생성 스크립트(figgen/). 발표 영상은 별도 파일로 제출. archive_parallel_design/ = 팀 내 병행 설계 라인의 이전 자료(참고용)</w:t>
             </w:r>
           </w:p>
         </w:tc>
@@ -592,7 +592,7 @@
                 <w:b w:val="0"/>
                 <w:sz w:val="18"/>
               </w:rPr>
-              <w:t>병행 설계(행 클록 게이팅, blink, hold ECO 등)의 P&amp;R 리포트와 시도·기각 전체 기록(§1~§235)</w:t>
+              <w:t>병행 설계(행 클록 게이팅, blink, hold ECO 등)의 P&amp;R 리포트와 시도·기각 전체 기록(§1~§236)</w:t>
             </w:r>
           </w:p>
         </w:tc>
@@ -647,7 +647,7 @@
           <w:b w:val="0"/>
           <w:sz w:val="18"/>
         </w:rPr>
-        <w:t>② 정수 기준모델: cd ~/hyunsu_round2/code/results &amp;&amp; python job24_check.py roll  → ECC 대비 0.467° (센서 원본 .dvs 필요)</w:t>
+        <w:t>② 정수 기준모델: cd ~/hyunsu_round2/code/results &amp;&amp; python job24_check.py roll  → ECC 대비 0.467° (센서 원본 .dvs를 ~/hyunsu_round2/code/data/ 에 두어야 실행됨)</w:t>
       </w:r>
     </w:p>
     <w:p>

</xml_diff>